<commit_message>
Update CV and architectural portfolio
Co-Authored-By: Claude Opus 4.8 (1M context) <noreply@anthropic.com>
</commit_message>
<xml_diff>
--- a/cv.docx
+++ b/cv.docx
@@ -548,7 +548,25 @@
                 <w:sz w:val="18"/>
                 <w:szCs w:val="18"/>
               </w:rPr>
-              <w:t xml:space="preserve">Worked in collaboration with </w:t>
+              <w:t>Work</w:t>
+            </w:r>
+            <w:r>
+              <w:rPr>
+                <w:rFonts w:ascii="PT Sans" w:hAnsi="PT Sans"/>
+                <w:w w:val="110"/>
+                <w:sz w:val="18"/>
+                <w:szCs w:val="18"/>
+              </w:rPr>
+              <w:t>ing</w:t>
+            </w:r>
+            <w:r>
+              <w:rPr>
+                <w:rFonts w:ascii="PT Sans" w:hAnsi="PT Sans"/>
+                <w:w w:val="110"/>
+                <w:sz w:val="18"/>
+                <w:szCs w:val="18"/>
+              </w:rPr>
+              <w:t xml:space="preserve"> in collaboration with </w:t>
             </w:r>
             <w:r>
               <w:rPr>
@@ -579,7 +597,25 @@
                 <w:sz w:val="18"/>
                 <w:szCs w:val="18"/>
               </w:rPr>
-              <w:t xml:space="preserve"> on the development of generative design and automation </w:t>
+              <w:t xml:space="preserve"> on the development of </w:t>
+            </w:r>
+            <w:r>
+              <w:rPr>
+                <w:rFonts w:ascii="PT Sans" w:hAnsi="PT Sans"/>
+                <w:w w:val="110"/>
+                <w:sz w:val="18"/>
+                <w:szCs w:val="18"/>
+              </w:rPr>
+              <w:t xml:space="preserve">a </w:t>
+            </w:r>
+            <w:r>
+              <w:rPr>
+                <w:rFonts w:ascii="PT Sans" w:hAnsi="PT Sans"/>
+                <w:w w:val="110"/>
+                <w:sz w:val="18"/>
+                <w:szCs w:val="18"/>
+              </w:rPr>
+              <w:t xml:space="preserve">generative design and automation </w:t>
             </w:r>
             <w:r>
               <w:rPr>
@@ -1799,15 +1835,20 @@
                 <w:w w:val="110"/>
               </w:rPr>
             </w:pPr>
-            <w:r>
-              <w:rPr>
-                <w:rFonts w:ascii="PT Sans" w:hAnsi="PT Sans"/>
-                <w:w w:val="110"/>
-                <w:sz w:val="18"/>
-                <w:szCs w:val="18"/>
-              </w:rPr>
-              <w:t>Bachelor of Architecture</w:t>
-            </w:r>
+            <w:hyperlink r:id="rId10" w:history="1">
+              <w:r>
+                <w:rPr>
+                  <w:rStyle w:val="Hyperlink"/>
+                  <w:rFonts w:ascii="PT Sans" w:hAnsi="PT Sans"/>
+                  <w:color w:val="7F7F7F" w:themeColor="text1" w:themeTint="80"/>
+                  <w:w w:val="110"/>
+                  <w:sz w:val="18"/>
+                  <w:szCs w:val="18"/>
+                  <w:u w:val="dotted"/>
+                </w:rPr>
+                <w:t>Bachelor of Architecture</w:t>
+              </w:r>
+            </w:hyperlink>
           </w:p>
         </w:tc>
         <w:tc>
@@ -2070,9 +2111,15 @@
     </w:tbl>
     <w:p>
       <w:pPr>
+        <w:spacing w:after="0"/>
         <w:rPr>
-          <w:sz w:val="2"/>
-          <w:szCs w:val="2"/>
+          <w:rStyle w:val="Hyperlink"/>
+          <w:rFonts w:ascii="PT Sans" w:hAnsi="PT Sans"/>
+          <w:color w:val="7F7F7F" w:themeColor="text1" w:themeTint="80"/>
+          <w:w w:val="110"/>
+          <w:sz w:val="18"/>
+          <w:szCs w:val="18"/>
+          <w:u w:val="dotted"/>
         </w:rPr>
       </w:pPr>
     </w:p>
@@ -2137,7 +2184,6 @@
                 <w:w w:val="110"/>
                 <w:szCs w:val="22"/>
               </w:rPr>
-              <w:lastRenderedPageBreak/>
               <w:t>CERTIFICATION</w:t>
             </w:r>
             <w:r>

</xml_diff>

<commit_message>
Update CV and architectural portfolio (#80)
* Update CV

Co-Authored-By: Claude Opus 4.8 (1M context) <noreply@anthropic.com>

* Update CV and architectural portfolio

Co-Authored-By: Claude Opus 4.8 (1M context) <noreply@anthropic.com>

---------

Co-authored-by: Claude Opus 4.8 (1M context) <noreply@anthropic.com>
</commit_message>
<xml_diff>
--- a/cv.docx
+++ b/cv.docx
@@ -43,6 +43,9 @@
               <w:bottom w:val="nil"/>
               <w:right w:val="nil"/>
             </w:tcBorders>
+            <w:tcMar>
+              <w:top w:w="0" w:type="dxa"/>
+            </w:tcMar>
           </w:tcPr>
           <w:p>
             <w:pPr>
@@ -77,6 +80,9 @@
               <w:bottom w:val="nil"/>
               <w:right w:val="nil"/>
             </w:tcBorders>
+            <w:tcMar>
+              <w:top w:w="57" w:type="dxa"/>
+            </w:tcMar>
             <w:vAlign w:val="center"/>
           </w:tcPr>
           <w:p>
@@ -117,15 +123,6 @@
                 <w:szCs w:val="18"/>
               </w:rPr>
             </w:pPr>
-            <w:r>
-              <w:rPr>
-                <w:rFonts w:ascii="PT Sans" w:hAnsi="PT Sans"/>
-                <w:w w:val="110"/>
-                <w:sz w:val="18"/>
-                <w:szCs w:val="18"/>
-              </w:rPr>
-              <w:br/>
-            </w:r>
             <w:r>
               <w:rPr>
                 <w:rFonts w:ascii="PT Sans" w:hAnsi="PT Sans"/>
@@ -232,7 +229,7 @@
                 <w:sz w:val="18"/>
                 <w:szCs w:val="18"/>
               </w:rPr>
-              <w:t>May</w:t>
+              <w:t>Jun</w:t>
             </w:r>
             <w:r>
               <w:rPr>
@@ -276,7 +273,7 @@
             <w:pPr>
               <w:spacing w:line="360" w:lineRule="auto"/>
               <w:rPr>
-                <w:rFonts w:ascii="PT Sans" w:hAnsi="PT Sans"/>
+                <w:rFonts w:ascii="PT Sans" w:hAnsi="PT Sans" w:hint="eastAsia"/>
                 <w:b/>
                 <w:bCs/>
                 <w:w w:val="110"/>
@@ -291,7 +288,7 @@
                 <w:w w:val="110"/>
                 <w:szCs w:val="22"/>
               </w:rPr>
-              <w:t>INTERESTS</w:t>
+              <w:t>SUMMARY</w:t>
             </w:r>
           </w:p>
           <w:p>
@@ -312,79 +309,1161 @@
                 <w:sz w:val="18"/>
                 <w:szCs w:val="18"/>
               </w:rPr>
-              <w:t xml:space="preserve">Data-Driven Space Design, </w:t>
-            </w:r>
-            <w:r>
-              <w:rPr>
-                <w:rFonts w:ascii="PT Sans" w:hAnsi="PT Sans"/>
-                <w:w w:val="110"/>
-                <w:sz w:val="18"/>
-                <w:szCs w:val="18"/>
-              </w:rPr>
-              <w:t xml:space="preserve">Agentic </w:t>
-            </w:r>
-            <w:r>
-              <w:rPr>
-                <w:rFonts w:ascii="PT Sans" w:hAnsi="PT Sans"/>
-                <w:w w:val="110"/>
-                <w:sz w:val="18"/>
-                <w:szCs w:val="18"/>
-              </w:rPr>
-              <w:t>Space Generation</w:t>
-            </w:r>
-            <w:r>
-              <w:rPr>
-                <w:rFonts w:ascii="PT Sans" w:hAnsi="PT Sans"/>
-                <w:w w:val="110"/>
-                <w:sz w:val="18"/>
-                <w:szCs w:val="18"/>
-              </w:rPr>
-              <w:t xml:space="preserve">, </w:t>
-            </w:r>
-            <w:r>
-              <w:rPr>
-                <w:rFonts w:ascii="PT Sans" w:hAnsi="PT Sans"/>
-                <w:w w:val="110"/>
-                <w:sz w:val="18"/>
-                <w:szCs w:val="18"/>
-              </w:rPr>
-              <w:t>Building Information Modeling</w:t>
-            </w:r>
-            <w:r>
-              <w:rPr>
-                <w:rFonts w:ascii="PT Sans" w:hAnsi="PT Sans"/>
-                <w:w w:val="110"/>
-                <w:sz w:val="18"/>
-                <w:szCs w:val="18"/>
-              </w:rPr>
-              <w:t xml:space="preserve"> (BIM)</w:t>
-            </w:r>
-            <w:r>
-              <w:rPr>
-                <w:rFonts w:ascii="PT Sans" w:hAnsi="PT Sans"/>
-                <w:w w:val="110"/>
-                <w:sz w:val="18"/>
-                <w:szCs w:val="18"/>
-              </w:rPr>
-              <w:t xml:space="preserve">, </w:t>
-            </w:r>
-            <w:r>
-              <w:rPr>
-                <w:rFonts w:ascii="PT Sans" w:hAnsi="PT Sans"/>
-                <w:w w:val="110"/>
-                <w:sz w:val="18"/>
-                <w:szCs w:val="18"/>
-              </w:rPr>
-              <w:t>Machine Learning</w:t>
-            </w:r>
-            <w:r>
-              <w:rPr>
-                <w:rFonts w:ascii="PT Sans" w:hAnsi="PT Sans"/>
-                <w:w w:val="110"/>
-                <w:sz w:val="18"/>
-                <w:szCs w:val="18"/>
-              </w:rPr>
-              <w:t>, Geometry Processing</w:t>
+              <w:t>Software Engineer and Computational Designer with a background in architecture and computer science, specializing in generative design. Experienced in developing spatial data systems and machine learning applications for design automation.</w:t>
+            </w:r>
+          </w:p>
+        </w:tc>
+      </w:tr>
+      <w:tr>
+        <w:trPr>
+          <w:trHeight w:val="18"/>
+        </w:trPr>
+        <w:tc>
+          <w:tcPr>
+            <w:tcW w:w="9621" w:type="dxa"/>
+            <w:gridSpan w:val="5"/>
+            <w:tcBorders>
+              <w:top w:val="single" w:sz="4" w:space="0" w:color="auto"/>
+              <w:bottom w:val="nil"/>
+            </w:tcBorders>
+            <w:tcMar>
+              <w:bottom w:w="0" w:type="dxa"/>
+            </w:tcMar>
+          </w:tcPr>
+          <w:p>
+            <w:pPr>
+              <w:spacing w:line="276" w:lineRule="auto"/>
+              <w:rPr>
+                <w:rFonts w:ascii="PT Sans" w:hAnsi="PT Sans"/>
+                <w:b/>
+                <w:bCs/>
+                <w:w w:val="110"/>
+                <w:sz w:val="18"/>
+                <w:szCs w:val="18"/>
+              </w:rPr>
+            </w:pPr>
+            <w:r>
+              <w:rPr>
+                <w:rFonts w:ascii="PT Sans" w:hAnsi="PT Sans"/>
+                <w:b/>
+                <w:bCs/>
+                <w:w w:val="110"/>
+              </w:rPr>
+              <w:t>EXPERIENCE</w:t>
+            </w:r>
+          </w:p>
+        </w:tc>
+      </w:tr>
+      <w:tr>
+        <w:trPr>
+          <w:trHeight w:val="18"/>
+        </w:trPr>
+        <w:tc>
+          <w:tcPr>
+            <w:tcW w:w="7326" w:type="dxa"/>
+            <w:gridSpan w:val="2"/>
+            <w:tcBorders>
+              <w:top w:val="nil"/>
+              <w:bottom w:val="nil"/>
+              <w:right w:val="nil"/>
+            </w:tcBorders>
+            <w:tcMar>
+              <w:bottom w:w="0" w:type="dxa"/>
+            </w:tcMar>
+          </w:tcPr>
+          <w:p>
+            <w:pPr>
+              <w:spacing w:line="360" w:lineRule="auto"/>
+              <w:rPr>
+                <w:rFonts w:ascii="PT Sans" w:hAnsi="PT Sans"/>
+                <w:b/>
+                <w:bCs/>
+                <w:w w:val="110"/>
+                <w:sz w:val="18"/>
+                <w:szCs w:val="18"/>
+              </w:rPr>
+            </w:pPr>
+            <w:r>
+              <w:rPr>
+                <w:rFonts w:ascii="PT Sans" w:hAnsi="PT Sans"/>
+                <w:b/>
+                <w:bCs/>
+                <w:w w:val="110"/>
+                <w:sz w:val="18"/>
+                <w:szCs w:val="18"/>
+              </w:rPr>
+              <w:t>Software Engineer</w:t>
+            </w:r>
+            <w:r>
+              <w:rPr>
+                <w:rFonts w:ascii="PT Sans" w:hAnsi="PT Sans"/>
+                <w:b/>
+                <w:bCs/>
+                <w:w w:val="110"/>
+                <w:sz w:val="18"/>
+                <w:szCs w:val="18"/>
+              </w:rPr>
+              <w:t xml:space="preserve"> </w:t>
+            </w:r>
+            <w:r>
+              <w:rPr>
+                <w:rFonts w:ascii="PT Sans" w:hAnsi="PT Sans"/>
+                <w:i/>
+                <w:iCs/>
+                <w:w w:val="110"/>
+                <w:sz w:val="18"/>
+                <w:szCs w:val="18"/>
+              </w:rPr>
+              <w:t xml:space="preserve">@ </w:t>
+            </w:r>
+            <w:r>
+              <w:rPr>
+                <w:rFonts w:ascii="PT Sans" w:hAnsi="PT Sans"/>
+                <w:i/>
+                <w:iCs/>
+                <w:w w:val="110"/>
+                <w:sz w:val="18"/>
+                <w:szCs w:val="18"/>
+              </w:rPr>
+              <w:t>aaro</w:t>
+            </w:r>
+          </w:p>
+        </w:tc>
+        <w:tc>
+          <w:tcPr>
+            <w:tcW w:w="2295" w:type="dxa"/>
+            <w:gridSpan w:val="3"/>
+            <w:tcBorders>
+              <w:top w:val="nil"/>
+              <w:left w:val="nil"/>
+              <w:bottom w:val="nil"/>
+            </w:tcBorders>
+            <w:tcMar>
+              <w:bottom w:w="0" w:type="dxa"/>
+            </w:tcMar>
+          </w:tcPr>
+          <w:p>
+            <w:pPr>
+              <w:spacing w:line="360" w:lineRule="auto"/>
+              <w:jc w:val="right"/>
+              <w:rPr>
+                <w:rFonts w:ascii="PT Sans" w:hAnsi="PT Sans"/>
+                <w:b/>
+                <w:bCs/>
+                <w:w w:val="110"/>
+                <w:sz w:val="18"/>
+                <w:szCs w:val="18"/>
+              </w:rPr>
+            </w:pPr>
+            <w:r>
+              <w:rPr>
+                <w:rFonts w:ascii="PT Sans" w:hAnsi="PT Sans" w:hint="eastAsia"/>
+                <w:b/>
+                <w:bCs/>
+                <w:w w:val="110"/>
+                <w:sz w:val="18"/>
+                <w:szCs w:val="18"/>
+              </w:rPr>
+              <w:t>Mar 2026</w:t>
+            </w:r>
+            <w:r>
+              <w:rPr>
+                <w:rFonts w:ascii="PT Sans" w:hAnsi="PT Sans"/>
+                <w:b/>
+                <w:bCs/>
+                <w:w w:val="110"/>
+                <w:sz w:val="18"/>
+                <w:szCs w:val="18"/>
+              </w:rPr>
+              <w:t xml:space="preserve"> </w:t>
+            </w:r>
+            <w:r>
+              <w:rPr>
+                <w:rFonts w:ascii="PT Sans" w:hAnsi="PT Sans"/>
+                <w:b/>
+                <w:bCs/>
+                <w:w w:val="110"/>
+                <w:sz w:val="18"/>
+                <w:szCs w:val="18"/>
+              </w:rPr>
+              <w:t>–</w:t>
+            </w:r>
+            <w:r>
+              <w:rPr>
+                <w:rFonts w:ascii="PT Sans" w:hAnsi="PT Sans"/>
+                <w:b/>
+                <w:bCs/>
+                <w:w w:val="110"/>
+                <w:sz w:val="18"/>
+                <w:szCs w:val="18"/>
+              </w:rPr>
+              <w:t xml:space="preserve"> </w:t>
+            </w:r>
+            <w:r>
+              <w:rPr>
+                <w:rFonts w:ascii="PT Sans" w:hAnsi="PT Sans" w:hint="eastAsia"/>
+                <w:b/>
+                <w:bCs/>
+                <w:w w:val="110"/>
+                <w:sz w:val="18"/>
+                <w:szCs w:val="18"/>
+              </w:rPr>
+              <w:t>Present</w:t>
+            </w:r>
+          </w:p>
+        </w:tc>
+      </w:tr>
+      <w:tr>
+        <w:trPr>
+          <w:trHeight w:val="102"/>
+        </w:trPr>
+        <w:tc>
+          <w:tcPr>
+            <w:tcW w:w="9621" w:type="dxa"/>
+            <w:gridSpan w:val="5"/>
+            <w:tcBorders>
+              <w:top w:val="nil"/>
+              <w:bottom w:val="nil"/>
+            </w:tcBorders>
+            <w:tcMar>
+              <w:top w:w="0" w:type="dxa"/>
+              <w:bottom w:w="142" w:type="dxa"/>
+            </w:tcMar>
+          </w:tcPr>
+          <w:p>
+            <w:pPr>
+              <w:spacing w:line="276" w:lineRule="auto"/>
+              <w:jc w:val="both"/>
+              <w:rPr>
+                <w:rFonts w:ascii="PT Sans" w:hAnsi="PT Sans"/>
+                <w:w w:val="110"/>
+                <w:sz w:val="18"/>
+                <w:szCs w:val="18"/>
+              </w:rPr>
+            </w:pPr>
+            <w:r>
+              <w:rPr>
+                <w:rFonts w:ascii="PT Sans" w:hAnsi="PT Sans"/>
+                <w:w w:val="110"/>
+                <w:sz w:val="18"/>
+                <w:szCs w:val="18"/>
+              </w:rPr>
+              <w:t>Work</w:t>
+            </w:r>
+            <w:r>
+              <w:rPr>
+                <w:rFonts w:ascii="PT Sans" w:hAnsi="PT Sans"/>
+                <w:w w:val="110"/>
+                <w:sz w:val="18"/>
+                <w:szCs w:val="18"/>
+              </w:rPr>
+              <w:t>ing</w:t>
+            </w:r>
+            <w:r>
+              <w:rPr>
+                <w:rFonts w:ascii="PT Sans" w:hAnsi="PT Sans"/>
+                <w:w w:val="110"/>
+                <w:sz w:val="18"/>
+                <w:szCs w:val="18"/>
+              </w:rPr>
+              <w:t xml:space="preserve"> in collaboration with </w:t>
+            </w:r>
+            <w:r>
+              <w:rPr>
+                <w:rFonts w:ascii="PT Sans" w:hAnsi="PT Sans" w:hint="eastAsia"/>
+                <w:i/>
+                <w:iCs/>
+                <w:w w:val="110"/>
+                <w:sz w:val="18"/>
+                <w:szCs w:val="18"/>
+              </w:rPr>
+              <w:t>n</w:t>
+            </w:r>
+            <w:r>
+              <w:rPr>
+                <w:rFonts w:ascii="PT Sans" w:hAnsi="PT Sans"/>
+                <w:i/>
+                <w:iCs/>
+                <w:w w:val="110"/>
+                <w:sz w:val="18"/>
+                <w:szCs w:val="18"/>
+              </w:rPr>
+              <w:t>eoBIM</w:t>
+            </w:r>
+            <w:r>
+              <w:rPr>
+                <w:rFonts w:ascii="PT Sans" w:hAnsi="PT Sans"/>
+                <w:w w:val="110"/>
+                <w:sz w:val="18"/>
+                <w:szCs w:val="18"/>
+              </w:rPr>
+              <w:t xml:space="preserve"> on the development of </w:t>
+            </w:r>
+            <w:r>
+              <w:rPr>
+                <w:rFonts w:ascii="PT Sans" w:hAnsi="PT Sans"/>
+                <w:w w:val="110"/>
+                <w:sz w:val="18"/>
+                <w:szCs w:val="18"/>
+              </w:rPr>
+              <w:t xml:space="preserve">a </w:t>
+            </w:r>
+            <w:r>
+              <w:rPr>
+                <w:rFonts w:ascii="PT Sans" w:hAnsi="PT Sans"/>
+                <w:w w:val="110"/>
+                <w:sz w:val="18"/>
+                <w:szCs w:val="18"/>
+              </w:rPr>
+              <w:t xml:space="preserve">generative design and automation </w:t>
+            </w:r>
+            <w:r>
+              <w:rPr>
+                <w:rFonts w:ascii="PT Sans" w:hAnsi="PT Sans"/>
+                <w:w w:val="110"/>
+                <w:sz w:val="18"/>
+                <w:szCs w:val="18"/>
+              </w:rPr>
+              <w:t>product</w:t>
+            </w:r>
+            <w:r>
+              <w:rPr>
+                <w:rFonts w:ascii="PT Sans" w:hAnsi="PT Sans"/>
+                <w:w w:val="110"/>
+                <w:sz w:val="18"/>
+                <w:szCs w:val="18"/>
+              </w:rPr>
+              <w:t xml:space="preserve"> for architectural planning and feasibility analysis based on German building regulations and planning codes</w:t>
+            </w:r>
+            <w:r>
+              <w:rPr>
+                <w:rFonts w:ascii="PT Sans" w:hAnsi="PT Sans" w:hint="eastAsia"/>
+                <w:w w:val="110"/>
+                <w:sz w:val="18"/>
+                <w:szCs w:val="18"/>
+              </w:rPr>
+              <w:t xml:space="preserve">. </w:t>
+            </w:r>
+          </w:p>
+        </w:tc>
+      </w:tr>
+      <w:tr>
+        <w:trPr>
+          <w:trHeight w:val="20"/>
+        </w:trPr>
+        <w:tc>
+          <w:tcPr>
+            <w:tcW w:w="7326" w:type="dxa"/>
+            <w:gridSpan w:val="2"/>
+            <w:tcBorders>
+              <w:top w:val="nil"/>
+              <w:bottom w:val="nil"/>
+              <w:right w:val="nil"/>
+            </w:tcBorders>
+            <w:tcMar>
+              <w:bottom w:w="0" w:type="dxa"/>
+            </w:tcMar>
+          </w:tcPr>
+          <w:p>
+            <w:pPr>
+              <w:spacing w:line="360" w:lineRule="auto"/>
+              <w:rPr>
+                <w:rFonts w:ascii="PT Sans" w:hAnsi="PT Sans"/>
+                <w:b/>
+                <w:bCs/>
+                <w:w w:val="110"/>
+              </w:rPr>
+            </w:pPr>
+            <w:r>
+              <w:rPr>
+                <w:rFonts w:ascii="PT Sans" w:hAnsi="PT Sans" w:hint="eastAsia"/>
+                <w:b/>
+                <w:bCs/>
+                <w:w w:val="110"/>
+                <w:sz w:val="18"/>
+                <w:szCs w:val="18"/>
+              </w:rPr>
+              <w:t>Research Intern</w:t>
+            </w:r>
+            <w:r>
+              <w:rPr>
+                <w:rFonts w:ascii="PT Sans" w:hAnsi="PT Sans"/>
+                <w:b/>
+                <w:bCs/>
+                <w:w w:val="110"/>
+                <w:sz w:val="18"/>
+                <w:szCs w:val="18"/>
+              </w:rPr>
+              <w:t xml:space="preserve"> </w:t>
+            </w:r>
+            <w:r>
+              <w:rPr>
+                <w:rFonts w:ascii="PT Sans" w:hAnsi="PT Sans"/>
+                <w:i/>
+                <w:iCs/>
+                <w:w w:val="110"/>
+                <w:sz w:val="18"/>
+                <w:szCs w:val="18"/>
+              </w:rPr>
+              <w:t xml:space="preserve">@ </w:t>
+            </w:r>
+            <w:r>
+              <w:rPr>
+                <w:rFonts w:ascii="PT Sans" w:hAnsi="PT Sans" w:hint="eastAsia"/>
+                <w:i/>
+                <w:iCs/>
+                <w:w w:val="110"/>
+                <w:sz w:val="18"/>
+                <w:szCs w:val="18"/>
+              </w:rPr>
+              <w:t>Visual Media Lab, KAIST</w:t>
+            </w:r>
+          </w:p>
+        </w:tc>
+        <w:tc>
+          <w:tcPr>
+            <w:tcW w:w="2295" w:type="dxa"/>
+            <w:gridSpan w:val="3"/>
+            <w:tcBorders>
+              <w:top w:val="nil"/>
+              <w:left w:val="nil"/>
+              <w:bottom w:val="nil"/>
+            </w:tcBorders>
+            <w:tcMar>
+              <w:bottom w:w="0" w:type="dxa"/>
+            </w:tcMar>
+          </w:tcPr>
+          <w:p>
+            <w:pPr>
+              <w:spacing w:line="360" w:lineRule="auto"/>
+              <w:jc w:val="right"/>
+              <w:rPr>
+                <w:rFonts w:ascii="PT Sans" w:hAnsi="PT Sans"/>
+                <w:b/>
+                <w:bCs/>
+                <w:w w:val="110"/>
+                <w:sz w:val="18"/>
+                <w:szCs w:val="18"/>
+              </w:rPr>
+            </w:pPr>
+            <w:r>
+              <w:rPr>
+                <w:rFonts w:ascii="PT Sans" w:hAnsi="PT Sans" w:hint="eastAsia"/>
+                <w:b/>
+                <w:bCs/>
+                <w:w w:val="110"/>
+                <w:sz w:val="18"/>
+                <w:szCs w:val="18"/>
+              </w:rPr>
+              <w:t>Dec</w:t>
+            </w:r>
+            <w:r>
+              <w:rPr>
+                <w:rFonts w:ascii="PT Sans" w:hAnsi="PT Sans"/>
+                <w:b/>
+                <w:bCs/>
+                <w:w w:val="110"/>
+                <w:sz w:val="18"/>
+                <w:szCs w:val="18"/>
+              </w:rPr>
+              <w:t xml:space="preserve"> 202</w:t>
+            </w:r>
+            <w:r>
+              <w:rPr>
+                <w:rFonts w:ascii="PT Sans" w:hAnsi="PT Sans" w:hint="eastAsia"/>
+                <w:b/>
+                <w:bCs/>
+                <w:w w:val="110"/>
+                <w:sz w:val="18"/>
+                <w:szCs w:val="18"/>
+              </w:rPr>
+              <w:t>5</w:t>
+            </w:r>
+            <w:r>
+              <w:rPr>
+                <w:rFonts w:ascii="PT Sans" w:hAnsi="PT Sans"/>
+                <w:b/>
+                <w:bCs/>
+                <w:w w:val="110"/>
+                <w:sz w:val="18"/>
+                <w:szCs w:val="18"/>
+              </w:rPr>
+              <w:t xml:space="preserve"> </w:t>
+            </w:r>
+            <w:r>
+              <w:rPr>
+                <w:rFonts w:ascii="PT Sans" w:hAnsi="PT Sans"/>
+                <w:b/>
+                <w:bCs/>
+                <w:w w:val="110"/>
+                <w:sz w:val="18"/>
+                <w:szCs w:val="18"/>
+              </w:rPr>
+              <w:t>–</w:t>
+            </w:r>
+            <w:r>
+              <w:rPr>
+                <w:rFonts w:ascii="PT Sans" w:hAnsi="PT Sans"/>
+                <w:b/>
+                <w:bCs/>
+                <w:w w:val="110"/>
+                <w:sz w:val="18"/>
+                <w:szCs w:val="18"/>
+              </w:rPr>
+              <w:t xml:space="preserve"> </w:t>
+            </w:r>
+            <w:r>
+              <w:rPr>
+                <w:rFonts w:ascii="PT Sans" w:hAnsi="PT Sans" w:hint="eastAsia"/>
+                <w:b/>
+                <w:bCs/>
+                <w:w w:val="110"/>
+                <w:sz w:val="18"/>
+                <w:szCs w:val="18"/>
+              </w:rPr>
+              <w:t>Feb 2026</w:t>
+            </w:r>
+          </w:p>
+        </w:tc>
+      </w:tr>
+      <w:tr>
+        <w:trPr>
+          <w:trHeight w:val="57"/>
+        </w:trPr>
+        <w:tc>
+          <w:tcPr>
+            <w:tcW w:w="9621" w:type="dxa"/>
+            <w:gridSpan w:val="5"/>
+            <w:tcBorders>
+              <w:top w:val="nil"/>
+              <w:bottom w:val="nil"/>
+            </w:tcBorders>
+            <w:tcMar>
+              <w:top w:w="0" w:type="dxa"/>
+            </w:tcMar>
+          </w:tcPr>
+          <w:p>
+            <w:pPr>
+              <w:pStyle w:val="ListParagraph"/>
+              <w:spacing w:line="276" w:lineRule="auto"/>
+              <w:ind w:leftChars="-1" w:left="-2"/>
+              <w:jc w:val="both"/>
+              <w:rPr>
+                <w:rFonts w:ascii="PT Sans" w:hAnsi="PT Sans"/>
+                <w:w w:val="110"/>
+                <w:sz w:val="18"/>
+                <w:szCs w:val="18"/>
+              </w:rPr>
+            </w:pPr>
+            <w:r>
+              <w:rPr>
+                <w:rFonts w:ascii="PT Sans" w:hAnsi="PT Sans"/>
+                <w:w w:val="110"/>
+                <w:sz w:val="18"/>
+                <w:szCs w:val="18"/>
+              </w:rPr>
+              <w:t>Contributed to the development of a multimodal virtual space automation system funded by KOCCA, focusing on converting interior image inputs into coherent 3D scenes using models for image-to-3D reconstruction, object detection, and semantic segmentation.</w:t>
+            </w:r>
+          </w:p>
+        </w:tc>
+      </w:tr>
+      <w:tr>
+        <w:trPr>
+          <w:trHeight w:val="18"/>
+        </w:trPr>
+        <w:tc>
+          <w:tcPr>
+            <w:tcW w:w="6804" w:type="dxa"/>
+            <w:tcBorders>
+              <w:top w:val="nil"/>
+              <w:bottom w:val="nil"/>
+              <w:right w:val="nil"/>
+            </w:tcBorders>
+            <w:tcMar>
+              <w:bottom w:w="0" w:type="dxa"/>
+            </w:tcMar>
+          </w:tcPr>
+          <w:p>
+            <w:pPr>
+              <w:spacing w:line="276" w:lineRule="auto"/>
+              <w:jc w:val="both"/>
+              <w:rPr>
+                <w:rFonts w:ascii="PT Sans" w:hAnsi="PT Sans"/>
+                <w:b/>
+                <w:bCs/>
+                <w:w w:val="110"/>
+                <w:sz w:val="18"/>
+                <w:szCs w:val="18"/>
+              </w:rPr>
+            </w:pPr>
+            <w:r>
+              <w:rPr>
+                <w:rFonts w:ascii="PT Sans" w:hAnsi="PT Sans" w:hint="eastAsia"/>
+                <w:b/>
+                <w:bCs/>
+                <w:w w:val="110"/>
+                <w:sz w:val="18"/>
+                <w:szCs w:val="18"/>
+              </w:rPr>
+              <w:t>Software Engineer</w:t>
+            </w:r>
+            <w:r>
+              <w:rPr>
+                <w:rFonts w:ascii="PT Sans" w:hAnsi="PT Sans"/>
+                <w:b/>
+                <w:bCs/>
+                <w:w w:val="110"/>
+                <w:sz w:val="18"/>
+                <w:szCs w:val="18"/>
+              </w:rPr>
+              <w:t xml:space="preserve"> </w:t>
+            </w:r>
+            <w:r>
+              <w:rPr>
+                <w:rFonts w:ascii="PT Sans" w:hAnsi="PT Sans"/>
+                <w:i/>
+                <w:iCs/>
+                <w:w w:val="110"/>
+                <w:sz w:val="18"/>
+                <w:szCs w:val="18"/>
+              </w:rPr>
+              <w:t xml:space="preserve">@ </w:t>
+            </w:r>
+            <w:r>
+              <w:rPr>
+                <w:rFonts w:ascii="PT Sans" w:hAnsi="PT Sans"/>
+                <w:i/>
+                <w:iCs/>
+                <w:w w:val="110"/>
+                <w:sz w:val="18"/>
+                <w:szCs w:val="18"/>
+              </w:rPr>
+              <w:t>Spacewalk</w:t>
+            </w:r>
+          </w:p>
+        </w:tc>
+        <w:tc>
+          <w:tcPr>
+            <w:tcW w:w="2817" w:type="dxa"/>
+            <w:gridSpan w:val="4"/>
+            <w:tcBorders>
+              <w:top w:val="nil"/>
+              <w:left w:val="nil"/>
+              <w:bottom w:val="nil"/>
+            </w:tcBorders>
+            <w:tcMar>
+              <w:bottom w:w="0" w:type="dxa"/>
+            </w:tcMar>
+          </w:tcPr>
+          <w:p>
+            <w:pPr>
+              <w:spacing w:line="360" w:lineRule="auto"/>
+              <w:jc w:val="right"/>
+              <w:rPr>
+                <w:rFonts w:ascii="PT Sans" w:hAnsi="PT Sans"/>
+                <w:b/>
+                <w:bCs/>
+                <w:w w:val="110"/>
+                <w:sz w:val="18"/>
+                <w:szCs w:val="18"/>
+              </w:rPr>
+            </w:pPr>
+            <w:r>
+              <w:rPr>
+                <w:rFonts w:ascii="PT Sans" w:hAnsi="PT Sans"/>
+                <w:b/>
+                <w:bCs/>
+                <w:w w:val="110"/>
+                <w:sz w:val="18"/>
+                <w:szCs w:val="18"/>
+              </w:rPr>
+              <w:t xml:space="preserve">Jan 2022 </w:t>
+            </w:r>
+            <w:r>
+              <w:rPr>
+                <w:rFonts w:ascii="PT Sans" w:hAnsi="PT Sans"/>
+                <w:b/>
+                <w:bCs/>
+                <w:w w:val="110"/>
+                <w:sz w:val="18"/>
+                <w:szCs w:val="18"/>
+              </w:rPr>
+              <w:t>–</w:t>
+            </w:r>
+            <w:r>
+              <w:rPr>
+                <w:rFonts w:ascii="PT Sans" w:hAnsi="PT Sans"/>
+                <w:b/>
+                <w:bCs/>
+                <w:w w:val="110"/>
+                <w:sz w:val="18"/>
+                <w:szCs w:val="18"/>
+              </w:rPr>
+              <w:t xml:space="preserve"> </w:t>
+            </w:r>
+            <w:r>
+              <w:rPr>
+                <w:rFonts w:ascii="PT Sans" w:hAnsi="PT Sans" w:hint="eastAsia"/>
+                <w:b/>
+                <w:bCs/>
+                <w:w w:val="110"/>
+                <w:sz w:val="18"/>
+                <w:szCs w:val="18"/>
+              </w:rPr>
+              <w:t>Nov 2025</w:t>
+            </w:r>
+          </w:p>
+        </w:tc>
+      </w:tr>
+      <w:tr>
+        <w:trPr>
+          <w:trHeight w:val="181"/>
+        </w:trPr>
+        <w:tc>
+          <w:tcPr>
+            <w:tcW w:w="9621" w:type="dxa"/>
+            <w:gridSpan w:val="5"/>
+            <w:tcBorders>
+              <w:top w:val="nil"/>
+              <w:bottom w:val="nil"/>
+            </w:tcBorders>
+            <w:tcMar>
+              <w:top w:w="0" w:type="dxa"/>
+              <w:bottom w:w="142" w:type="dxa"/>
+            </w:tcMar>
+          </w:tcPr>
+          <w:p>
+            <w:pPr>
+              <w:spacing w:line="276" w:lineRule="auto"/>
+              <w:jc w:val="both"/>
+              <w:rPr>
+                <w:rFonts w:ascii="PT Sans" w:hAnsi="PT Sans"/>
+                <w:w w:val="110"/>
+                <w:sz w:val="18"/>
+                <w:szCs w:val="18"/>
+              </w:rPr>
+            </w:pPr>
+            <w:r>
+              <w:rPr>
+                <w:rFonts w:ascii="PT Sans" w:hAnsi="PT Sans"/>
+                <w:w w:val="110"/>
+                <w:sz w:val="18"/>
+                <w:szCs w:val="18"/>
+              </w:rPr>
+              <w:t>Conducted research and development to productionize geometric algorithms for architectural planning and feasibility analysis. Developed computational design systems that translate spatial constraints, planning requirements, and geometric conditions into workflows for office layout automation, apartment placement, housing feasibility studies, and mass-planning.</w:t>
+            </w:r>
+          </w:p>
+        </w:tc>
+      </w:tr>
+      <w:tr>
+        <w:trPr>
+          <w:trHeight w:val="181"/>
+        </w:trPr>
+        <w:tc>
+          <w:tcPr>
+            <w:tcW w:w="6804" w:type="dxa"/>
+            <w:tcBorders>
+              <w:top w:val="nil"/>
+              <w:bottom w:val="nil"/>
+              <w:right w:val="nil"/>
+            </w:tcBorders>
+            <w:tcMar>
+              <w:bottom w:w="57" w:type="dxa"/>
+            </w:tcMar>
+          </w:tcPr>
+          <w:p>
+            <w:pPr>
+              <w:spacing w:line="276" w:lineRule="auto"/>
+              <w:jc w:val="both"/>
+              <w:rPr>
+                <w:rFonts w:ascii="PT Sans" w:hAnsi="PT Sans"/>
+                <w:w w:val="110"/>
+                <w:sz w:val="18"/>
+                <w:szCs w:val="18"/>
+              </w:rPr>
+            </w:pPr>
+            <w:r>
+              <w:rPr>
+                <w:rFonts w:ascii="PT Sans" w:hAnsi="PT Sans"/>
+                <w:b/>
+                <w:bCs/>
+                <w:w w:val="110"/>
+                <w:sz w:val="18"/>
+                <w:szCs w:val="18"/>
+              </w:rPr>
+              <w:t>Design</w:t>
+            </w:r>
+            <w:r>
+              <w:rPr>
+                <w:rFonts w:ascii="PT Sans" w:hAnsi="PT Sans" w:hint="eastAsia"/>
+                <w:b/>
+                <w:bCs/>
+                <w:w w:val="110"/>
+                <w:sz w:val="18"/>
+                <w:szCs w:val="18"/>
+              </w:rPr>
+              <w:t xml:space="preserve"> Intern</w:t>
+            </w:r>
+            <w:r>
+              <w:rPr>
+                <w:rFonts w:ascii="PT Sans" w:hAnsi="PT Sans"/>
+                <w:b/>
+                <w:bCs/>
+                <w:w w:val="110"/>
+                <w:sz w:val="18"/>
+                <w:szCs w:val="18"/>
+              </w:rPr>
+              <w:t xml:space="preserve"> </w:t>
+            </w:r>
+            <w:r>
+              <w:rPr>
+                <w:rFonts w:ascii="PT Sans" w:hAnsi="PT Sans"/>
+                <w:i/>
+                <w:iCs/>
+                <w:w w:val="110"/>
+                <w:sz w:val="18"/>
+                <w:szCs w:val="18"/>
+              </w:rPr>
+              <w:t xml:space="preserve">@ </w:t>
+            </w:r>
+            <w:r>
+              <w:rPr>
+                <w:rFonts w:ascii="PT Sans" w:hAnsi="PT Sans" w:hint="eastAsia"/>
+                <w:i/>
+                <w:iCs/>
+                <w:w w:val="110"/>
+                <w:sz w:val="18"/>
+                <w:szCs w:val="18"/>
+              </w:rPr>
+              <w:t>SANGJI</w:t>
+            </w:r>
+            <w:r>
+              <w:rPr>
+                <w:rFonts w:ascii="PT Sans" w:hAnsi="PT Sans"/>
+                <w:i/>
+                <w:iCs/>
+                <w:w w:val="110"/>
+                <w:sz w:val="18"/>
+                <w:szCs w:val="18"/>
+              </w:rPr>
+              <w:t xml:space="preserve"> </w:t>
+            </w:r>
+            <w:r>
+              <w:rPr>
+                <w:rFonts w:ascii="PT Sans" w:hAnsi="PT Sans" w:hint="eastAsia"/>
+                <w:i/>
+                <w:iCs/>
+                <w:w w:val="110"/>
+                <w:sz w:val="18"/>
+                <w:szCs w:val="18"/>
+              </w:rPr>
+              <w:t>Architects</w:t>
+            </w:r>
+          </w:p>
+        </w:tc>
+        <w:tc>
+          <w:tcPr>
+            <w:tcW w:w="2817" w:type="dxa"/>
+            <w:gridSpan w:val="4"/>
+            <w:tcBorders>
+              <w:top w:val="nil"/>
+              <w:left w:val="nil"/>
+              <w:bottom w:val="nil"/>
+            </w:tcBorders>
+            <w:tcMar>
+              <w:bottom w:w="57" w:type="dxa"/>
+            </w:tcMar>
+            <w:vAlign w:val="bottom"/>
+          </w:tcPr>
+          <w:p>
+            <w:pPr>
+              <w:spacing w:line="276" w:lineRule="auto"/>
+              <w:jc w:val="right"/>
+              <w:rPr>
+                <w:rFonts w:ascii="PT Sans" w:hAnsi="PT Sans"/>
+                <w:w w:val="110"/>
+                <w:sz w:val="18"/>
+                <w:szCs w:val="18"/>
+              </w:rPr>
+            </w:pPr>
+            <w:r>
+              <w:rPr>
+                <w:rFonts w:ascii="PT Sans" w:hAnsi="PT Sans"/>
+                <w:b/>
+                <w:bCs/>
+                <w:w w:val="110"/>
+                <w:sz w:val="18"/>
+                <w:szCs w:val="18"/>
+              </w:rPr>
+              <w:t>Jun 2019 – Jul 2019</w:t>
+            </w:r>
+          </w:p>
+        </w:tc>
+      </w:tr>
+      <w:tr>
+        <w:trPr>
+          <w:trHeight w:val="402"/>
+        </w:trPr>
+        <w:tc>
+          <w:tcPr>
+            <w:tcW w:w="9621" w:type="dxa"/>
+            <w:gridSpan w:val="5"/>
+            <w:tcBorders>
+              <w:top w:val="nil"/>
+              <w:bottom w:val="nil"/>
+            </w:tcBorders>
+            <w:tcMar>
+              <w:top w:w="0" w:type="dxa"/>
+            </w:tcMar>
+          </w:tcPr>
+          <w:p>
+            <w:pPr>
+              <w:spacing w:line="276" w:lineRule="auto"/>
+              <w:jc w:val="both"/>
+              <w:rPr>
+                <w:rFonts w:ascii="PT Sans" w:hAnsi="PT Sans"/>
+                <w:w w:val="110"/>
+                <w:sz w:val="18"/>
+                <w:szCs w:val="18"/>
+              </w:rPr>
+            </w:pPr>
+            <w:r>
+              <w:rPr>
+                <w:rFonts w:ascii="PT Sans" w:hAnsi="PT Sans"/>
+                <w:w w:val="110"/>
+                <w:sz w:val="18"/>
+                <w:szCs w:val="18"/>
+              </w:rPr>
+              <w:t>Supported architectural design development through drawings, 3D visualizations, site analysis, and mass studies. Assisted with competition proposals from concept development to schematic design.</w:t>
+            </w:r>
+          </w:p>
+        </w:tc>
+      </w:tr>
+      <w:tr>
+        <w:trPr>
+          <w:trHeight w:val="16"/>
+        </w:trPr>
+        <w:tc>
+          <w:tcPr>
+            <w:tcW w:w="7513" w:type="dxa"/>
+            <w:gridSpan w:val="4"/>
+            <w:tcBorders>
+              <w:top w:val="nil"/>
+              <w:bottom w:val="nil"/>
+              <w:right w:val="nil"/>
+            </w:tcBorders>
+            <w:tcMar>
+              <w:top w:w="142" w:type="dxa"/>
+              <w:bottom w:w="57" w:type="dxa"/>
+            </w:tcMar>
+          </w:tcPr>
+          <w:p>
+            <w:pPr>
+              <w:spacing w:line="276" w:lineRule="auto"/>
+              <w:jc w:val="both"/>
+              <w:rPr>
+                <w:rFonts w:ascii="PT Sans" w:hAnsi="PT Sans" w:hint="eastAsia"/>
+                <w:w w:val="110"/>
+                <w:sz w:val="18"/>
+                <w:szCs w:val="18"/>
+              </w:rPr>
+            </w:pPr>
+            <w:r>
+              <w:rPr>
+                <w:rFonts w:ascii="PT Sans" w:hAnsi="PT Sans" w:hint="eastAsia"/>
+                <w:b/>
+                <w:bCs/>
+                <w:w w:val="110"/>
+                <w:sz w:val="18"/>
+                <w:szCs w:val="18"/>
+              </w:rPr>
+              <w:t>Research Intern</w:t>
+            </w:r>
+            <w:r>
+              <w:rPr>
+                <w:rFonts w:ascii="PT Sans" w:hAnsi="PT Sans"/>
+                <w:b/>
+                <w:bCs/>
+                <w:w w:val="110"/>
+                <w:sz w:val="18"/>
+                <w:szCs w:val="18"/>
+              </w:rPr>
+              <w:t xml:space="preserve"> </w:t>
+            </w:r>
+            <w:r>
+              <w:rPr>
+                <w:rFonts w:ascii="PT Sans" w:hAnsi="PT Sans"/>
+                <w:i/>
+                <w:iCs/>
+                <w:w w:val="110"/>
+                <w:sz w:val="18"/>
+                <w:szCs w:val="18"/>
+              </w:rPr>
+              <w:t xml:space="preserve">@ </w:t>
+            </w:r>
+            <w:r>
+              <w:rPr>
+                <w:rFonts w:ascii="PT Sans" w:hAnsi="PT Sans" w:hint="eastAsia"/>
+                <w:i/>
+                <w:iCs/>
+                <w:w w:val="110"/>
+                <w:sz w:val="18"/>
+                <w:szCs w:val="18"/>
+              </w:rPr>
+              <w:t>DART lab, KNUT</w:t>
+            </w:r>
+          </w:p>
+        </w:tc>
+        <w:tc>
+          <w:tcPr>
+            <w:tcW w:w="2108" w:type="dxa"/>
+            <w:tcBorders>
+              <w:top w:val="nil"/>
+              <w:left w:val="nil"/>
+              <w:bottom w:val="nil"/>
+            </w:tcBorders>
+            <w:tcMar>
+              <w:top w:w="142" w:type="dxa"/>
+              <w:bottom w:w="57" w:type="dxa"/>
+            </w:tcMar>
+            <w:vAlign w:val="bottom"/>
+          </w:tcPr>
+          <w:p>
+            <w:pPr>
+              <w:spacing w:line="276" w:lineRule="auto"/>
+              <w:jc w:val="right"/>
+              <w:rPr>
+                <w:rFonts w:ascii="PT Sans" w:hAnsi="PT Sans"/>
+                <w:w w:val="110"/>
+                <w:sz w:val="18"/>
+                <w:szCs w:val="18"/>
+              </w:rPr>
+            </w:pPr>
+            <w:r>
+              <w:rPr>
+                <w:rFonts w:ascii="PT Sans" w:hAnsi="PT Sans" w:hint="eastAsia"/>
+                <w:b/>
+                <w:bCs/>
+                <w:w w:val="110"/>
+                <w:sz w:val="18"/>
+                <w:szCs w:val="18"/>
+              </w:rPr>
+              <w:t>Mar</w:t>
+            </w:r>
+            <w:r>
+              <w:rPr>
+                <w:rFonts w:ascii="PT Sans" w:hAnsi="PT Sans"/>
+                <w:b/>
+                <w:bCs/>
+                <w:w w:val="110"/>
+                <w:sz w:val="18"/>
+                <w:szCs w:val="18"/>
+              </w:rPr>
+              <w:t xml:space="preserve"> 201</w:t>
+            </w:r>
+            <w:r>
+              <w:rPr>
+                <w:rFonts w:ascii="PT Sans" w:hAnsi="PT Sans" w:hint="eastAsia"/>
+                <w:b/>
+                <w:bCs/>
+                <w:w w:val="110"/>
+                <w:sz w:val="18"/>
+                <w:szCs w:val="18"/>
+              </w:rPr>
+              <w:t>8</w:t>
+            </w:r>
+            <w:r>
+              <w:rPr>
+                <w:rFonts w:ascii="PT Sans" w:hAnsi="PT Sans"/>
+                <w:b/>
+                <w:bCs/>
+                <w:w w:val="110"/>
+                <w:sz w:val="18"/>
+                <w:szCs w:val="18"/>
+              </w:rPr>
+              <w:t xml:space="preserve"> – </w:t>
+            </w:r>
+            <w:r>
+              <w:rPr>
+                <w:rFonts w:ascii="PT Sans" w:hAnsi="PT Sans" w:hint="eastAsia"/>
+                <w:b/>
+                <w:bCs/>
+                <w:w w:val="110"/>
+                <w:sz w:val="18"/>
+                <w:szCs w:val="18"/>
+              </w:rPr>
+              <w:t>Apr</w:t>
+            </w:r>
+            <w:r>
+              <w:rPr>
+                <w:rFonts w:ascii="PT Sans" w:hAnsi="PT Sans"/>
+                <w:b/>
+                <w:bCs/>
+                <w:w w:val="110"/>
+                <w:sz w:val="18"/>
+                <w:szCs w:val="18"/>
+              </w:rPr>
+              <w:t xml:space="preserve"> 20</w:t>
+            </w:r>
+            <w:r>
+              <w:rPr>
+                <w:rFonts w:ascii="PT Sans" w:hAnsi="PT Sans" w:hint="eastAsia"/>
+                <w:b/>
+                <w:bCs/>
+                <w:w w:val="110"/>
+                <w:sz w:val="18"/>
+                <w:szCs w:val="18"/>
+              </w:rPr>
+              <w:t>19</w:t>
+            </w:r>
+          </w:p>
+        </w:tc>
+      </w:tr>
+      <w:tr>
+        <w:trPr>
+          <w:trHeight w:val="506"/>
+        </w:trPr>
+        <w:tc>
+          <w:tcPr>
+            <w:tcW w:w="9621" w:type="dxa"/>
+            <w:gridSpan w:val="5"/>
+            <w:tcBorders>
+              <w:top w:val="nil"/>
+              <w:bottom w:val="single" w:sz="4" w:space="0" w:color="auto"/>
+            </w:tcBorders>
+            <w:tcMar>
+              <w:top w:w="0" w:type="dxa"/>
+              <w:bottom w:w="142" w:type="dxa"/>
+            </w:tcMar>
+          </w:tcPr>
+          <w:p>
+            <w:pPr>
+              <w:spacing w:line="276" w:lineRule="auto"/>
+              <w:jc w:val="both"/>
+              <w:rPr>
+                <w:rFonts w:ascii="PT Sans" w:hAnsi="PT Sans"/>
+                <w:w w:val="110"/>
+                <w:sz w:val="18"/>
+                <w:szCs w:val="18"/>
+              </w:rPr>
+            </w:pPr>
+            <w:r>
+              <w:rPr>
+                <w:rFonts w:ascii="PT Sans" w:hAnsi="PT Sans"/>
+                <w:w w:val="110"/>
+                <w:sz w:val="18"/>
+                <w:szCs w:val="18"/>
+              </w:rPr>
+              <w:t>Assisted with architectural and urban design studies, developing parametric 3D models using Rhino and Grasshopper</w:t>
+            </w:r>
+            <w:r>
+              <w:rPr>
+                <w:rFonts w:ascii="PT Sans" w:hAnsi="PT Sans" w:hint="eastAsia"/>
+                <w:w w:val="110"/>
+                <w:sz w:val="18"/>
+                <w:szCs w:val="18"/>
+              </w:rPr>
+              <w:t xml:space="preserve">. </w:t>
             </w:r>
           </w:p>
         </w:tc>
@@ -596,7 +1675,7 @@
                 <w:sz w:val="18"/>
                 <w:szCs w:val="18"/>
               </w:rPr>
-              <w:t>Bachelor of Science in Computer Science – B.S.</w:t>
+              <w:t>Bachelor of Science in Computer Science</w:t>
             </w:r>
           </w:p>
         </w:tc>
@@ -625,15 +1704,6 @@
                 <w:szCs w:val="20"/>
               </w:rPr>
             </w:pPr>
-            <w:r>
-              <w:rPr>
-                <w:rFonts w:ascii="PT Sans" w:hAnsi="PT Sans"/>
-                <w:w w:val="110"/>
-                <w:sz w:val="18"/>
-                <w:szCs w:val="20"/>
-              </w:rPr>
-              <w:t>GPA: 4.20/4.50</w:t>
-            </w:r>
           </w:p>
         </w:tc>
       </w:tr>
@@ -765,15 +1835,20 @@
                 <w:w w:val="110"/>
               </w:rPr>
             </w:pPr>
-            <w:r>
-              <w:rPr>
-                <w:rFonts w:ascii="PT Sans" w:hAnsi="PT Sans"/>
-                <w:w w:val="110"/>
-                <w:sz w:val="18"/>
-                <w:szCs w:val="18"/>
-              </w:rPr>
-              <w:t>Bachelor of Architecture – B.Arch.</w:t>
-            </w:r>
+            <w:hyperlink r:id="rId10" w:history="1">
+              <w:r>
+                <w:rPr>
+                  <w:rStyle w:val="Hyperlink"/>
+                  <w:rFonts w:ascii="PT Sans" w:hAnsi="PT Sans"/>
+                  <w:color w:val="7F7F7F" w:themeColor="text1" w:themeTint="80"/>
+                  <w:w w:val="110"/>
+                  <w:sz w:val="18"/>
+                  <w:szCs w:val="18"/>
+                  <w:u w:val="dotted"/>
+                </w:rPr>
+                <w:t>Bachelor of Architecture</w:t>
+              </w:r>
+            </w:hyperlink>
           </w:p>
         </w:tc>
         <w:tc>
@@ -798,16 +1873,58 @@
                 <w:b/>
                 <w:bCs/>
                 <w:w w:val="110"/>
-              </w:rPr>
-            </w:pPr>
-            <w:r>
-              <w:rPr>
-                <w:rFonts w:ascii="PT Sans" w:hAnsi="PT Sans"/>
-                <w:w w:val="110"/>
                 <w:sz w:val="18"/>
                 <w:szCs w:val="20"/>
               </w:rPr>
-              <w:t>GPA: 3.84/4.50</w:t>
+            </w:pPr>
+          </w:p>
+        </w:tc>
+      </w:tr>
+      <w:tr>
+        <w:trPr>
+          <w:trHeight w:val="186"/>
+        </w:trPr>
+        <w:tc>
+          <w:tcPr>
+            <w:tcW w:w="9621" w:type="dxa"/>
+            <w:gridSpan w:val="5"/>
+            <w:tcBorders>
+              <w:top w:val="single" w:sz="4" w:space="0" w:color="auto"/>
+              <w:bottom w:val="nil"/>
+            </w:tcBorders>
+            <w:tcMar>
+              <w:bottom w:w="0" w:type="dxa"/>
+            </w:tcMar>
+          </w:tcPr>
+          <w:p>
+            <w:pPr>
+              <w:spacing w:line="276" w:lineRule="auto"/>
+              <w:jc w:val="both"/>
+              <w:rPr>
+                <w:rFonts w:ascii="PT Sans" w:hAnsi="PT Sans"/>
+                <w:w w:val="110"/>
+                <w:szCs w:val="22"/>
+              </w:rPr>
+            </w:pPr>
+            <w:r>
+              <w:rPr>
+                <w:rFonts w:ascii="PT Sans" w:hAnsi="PT Sans"/>
+                <w:b/>
+                <w:bCs/>
+                <w:w w:val="110"/>
+                <w:szCs w:val="22"/>
+              </w:rPr>
+              <w:t>PUBLICATION</w:t>
+            </w:r>
+            <w:r>
+              <w:rPr>
+                <w:rFonts w:ascii="PT Sans" w:hAnsi="PT Sans"/>
+                <w:b/>
+                <w:bCs/>
+                <w:w w:val="110"/>
+                <w:szCs w:val="22"/>
+              </w:rPr>
+              <w:t>S</w:t>
             </w:r>
           </w:p>
         </w:tc>
@@ -818,1173 +1935,6 @@
         </w:trPr>
         <w:tc>
           <w:tcPr>
-            <w:tcW w:w="9621" w:type="dxa"/>
-            <w:gridSpan w:val="5"/>
-            <w:tcBorders>
-              <w:top w:val="single" w:sz="4" w:space="0" w:color="auto"/>
-              <w:bottom w:val="nil"/>
-            </w:tcBorders>
-            <w:tcMar>
-              <w:bottom w:w="0" w:type="dxa"/>
-            </w:tcMar>
-          </w:tcPr>
-          <w:p>
-            <w:pPr>
-              <w:spacing w:line="276" w:lineRule="auto"/>
-              <w:rPr>
-                <w:rFonts w:ascii="PT Sans" w:hAnsi="PT Sans"/>
-                <w:b/>
-                <w:bCs/>
-                <w:w w:val="110"/>
-                <w:sz w:val="18"/>
-                <w:szCs w:val="18"/>
-              </w:rPr>
-            </w:pPr>
-            <w:r>
-              <w:rPr>
-                <w:rFonts w:ascii="PT Sans" w:hAnsi="PT Sans"/>
-                <w:b/>
-                <w:bCs/>
-                <w:w w:val="110"/>
-              </w:rPr>
-              <w:t>EXPERIENCE</w:t>
-            </w:r>
-          </w:p>
-        </w:tc>
-      </w:tr>
-      <w:tr>
-        <w:trPr>
-          <w:trHeight w:val="18"/>
-        </w:trPr>
-        <w:tc>
-          <w:tcPr>
-            <w:tcW w:w="7326" w:type="dxa"/>
-            <w:gridSpan w:val="2"/>
-            <w:tcBorders>
-              <w:top w:val="nil"/>
-              <w:bottom w:val="nil"/>
-              <w:right w:val="nil"/>
-            </w:tcBorders>
-            <w:tcMar>
-              <w:bottom w:w="0" w:type="dxa"/>
-            </w:tcMar>
-          </w:tcPr>
-          <w:p>
-            <w:pPr>
-              <w:spacing w:line="360" w:lineRule="auto"/>
-              <w:rPr>
-                <w:rFonts w:ascii="PT Sans" w:hAnsi="PT Sans"/>
-                <w:b/>
-                <w:bCs/>
-                <w:w w:val="110"/>
-                <w:sz w:val="18"/>
-                <w:szCs w:val="18"/>
-              </w:rPr>
-            </w:pPr>
-            <w:r>
-              <w:rPr>
-                <w:rFonts w:ascii="PT Sans" w:hAnsi="PT Sans" w:hint="eastAsia"/>
-                <w:b/>
-                <w:bCs/>
-                <w:w w:val="110"/>
-                <w:sz w:val="18"/>
-                <w:szCs w:val="18"/>
-              </w:rPr>
-              <w:t>Software Engineer</w:t>
-            </w:r>
-            <w:r>
-              <w:rPr>
-                <w:rFonts w:ascii="PT Sans" w:hAnsi="PT Sans"/>
-                <w:b/>
-                <w:bCs/>
-                <w:w w:val="110"/>
-                <w:sz w:val="18"/>
-                <w:szCs w:val="18"/>
-              </w:rPr>
-              <w:t xml:space="preserve"> </w:t>
-            </w:r>
-            <w:r>
-              <w:rPr>
-                <w:rFonts w:ascii="PT Sans" w:hAnsi="PT Sans"/>
-                <w:i/>
-                <w:iCs/>
-                <w:w w:val="110"/>
-                <w:sz w:val="18"/>
-                <w:szCs w:val="18"/>
-              </w:rPr>
-              <w:t xml:space="preserve">@ </w:t>
-            </w:r>
-            <w:r>
-              <w:rPr>
-                <w:rFonts w:ascii="PT Sans" w:hAnsi="PT Sans"/>
-                <w:i/>
-                <w:iCs/>
-                <w:w w:val="110"/>
-                <w:sz w:val="18"/>
-                <w:szCs w:val="18"/>
-              </w:rPr>
-              <w:t>aaro</w:t>
-            </w:r>
-          </w:p>
-        </w:tc>
-        <w:tc>
-          <w:tcPr>
-            <w:tcW w:w="2295" w:type="dxa"/>
-            <w:gridSpan w:val="3"/>
-            <w:tcBorders>
-              <w:top w:val="nil"/>
-              <w:left w:val="nil"/>
-              <w:bottom w:val="nil"/>
-            </w:tcBorders>
-            <w:tcMar>
-              <w:bottom w:w="0" w:type="dxa"/>
-            </w:tcMar>
-          </w:tcPr>
-          <w:p>
-            <w:pPr>
-              <w:spacing w:line="360" w:lineRule="auto"/>
-              <w:jc w:val="right"/>
-              <w:rPr>
-                <w:rFonts w:ascii="PT Sans" w:hAnsi="PT Sans"/>
-                <w:b/>
-                <w:bCs/>
-                <w:w w:val="110"/>
-                <w:sz w:val="18"/>
-                <w:szCs w:val="18"/>
-              </w:rPr>
-            </w:pPr>
-            <w:r>
-              <w:rPr>
-                <w:rFonts w:ascii="PT Sans" w:hAnsi="PT Sans" w:hint="eastAsia"/>
-                <w:b/>
-                <w:bCs/>
-                <w:w w:val="110"/>
-                <w:sz w:val="18"/>
-                <w:szCs w:val="18"/>
-              </w:rPr>
-              <w:t>Mar 2026</w:t>
-            </w:r>
-            <w:r>
-              <w:rPr>
-                <w:rFonts w:ascii="PT Sans" w:hAnsi="PT Sans"/>
-                <w:b/>
-                <w:bCs/>
-                <w:w w:val="110"/>
-                <w:sz w:val="18"/>
-                <w:szCs w:val="18"/>
-              </w:rPr>
-              <w:t xml:space="preserve"> </w:t>
-            </w:r>
-            <w:r>
-              <w:rPr>
-                <w:rFonts w:ascii="PT Sans" w:hAnsi="PT Sans"/>
-                <w:b/>
-                <w:bCs/>
-                <w:w w:val="110"/>
-                <w:sz w:val="18"/>
-                <w:szCs w:val="18"/>
-              </w:rPr>
-              <w:t>–</w:t>
-            </w:r>
-            <w:r>
-              <w:rPr>
-                <w:rFonts w:ascii="PT Sans" w:hAnsi="PT Sans"/>
-                <w:b/>
-                <w:bCs/>
-                <w:w w:val="110"/>
-                <w:sz w:val="18"/>
-                <w:szCs w:val="18"/>
-              </w:rPr>
-              <w:t xml:space="preserve"> </w:t>
-            </w:r>
-            <w:r>
-              <w:rPr>
-                <w:rFonts w:ascii="PT Sans" w:hAnsi="PT Sans" w:hint="eastAsia"/>
-                <w:b/>
-                <w:bCs/>
-                <w:w w:val="110"/>
-                <w:sz w:val="18"/>
-                <w:szCs w:val="18"/>
-              </w:rPr>
-              <w:t>Present</w:t>
-            </w:r>
-          </w:p>
-        </w:tc>
-      </w:tr>
-      <w:tr>
-        <w:trPr>
-          <w:trHeight w:val="102"/>
-        </w:trPr>
-        <w:tc>
-          <w:tcPr>
-            <w:tcW w:w="9621" w:type="dxa"/>
-            <w:gridSpan w:val="5"/>
-            <w:tcBorders>
-              <w:top w:val="nil"/>
-              <w:bottom w:val="nil"/>
-            </w:tcBorders>
-            <w:tcMar>
-              <w:top w:w="0" w:type="dxa"/>
-              <w:bottom w:w="142" w:type="dxa"/>
-            </w:tcMar>
-          </w:tcPr>
-          <w:p>
-            <w:pPr>
-              <w:spacing w:line="276" w:lineRule="auto"/>
-              <w:jc w:val="both"/>
-              <w:rPr>
-                <w:rFonts w:ascii="PT Sans" w:hAnsi="PT Sans"/>
-                <w:w w:val="110"/>
-                <w:sz w:val="18"/>
-                <w:szCs w:val="18"/>
-              </w:rPr>
-            </w:pPr>
-            <w:r>
-              <w:rPr>
-                <w:rFonts w:ascii="PT Sans" w:hAnsi="PT Sans"/>
-                <w:w w:val="110"/>
-                <w:sz w:val="18"/>
-                <w:szCs w:val="18"/>
-              </w:rPr>
-              <w:t xml:space="preserve">Worked in collaboration with </w:t>
-            </w:r>
-            <w:r>
-              <w:rPr>
-                <w:rFonts w:ascii="PT Sans" w:hAnsi="PT Sans" w:hint="eastAsia"/>
-                <w:i/>
-                <w:iCs/>
-                <w:w w:val="110"/>
-                <w:sz w:val="18"/>
-                <w:szCs w:val="18"/>
-              </w:rPr>
-              <w:t>n</w:t>
-            </w:r>
-            <w:r>
-              <w:rPr>
-                <w:rFonts w:ascii="PT Sans" w:hAnsi="PT Sans"/>
-                <w:i/>
-                <w:iCs/>
-                <w:w w:val="110"/>
-                <w:sz w:val="18"/>
-                <w:szCs w:val="18"/>
-              </w:rPr>
-              <w:t>eoBIM</w:t>
-            </w:r>
-            <w:r>
-              <w:rPr>
-                <w:rFonts w:ascii="PT Sans" w:hAnsi="PT Sans"/>
-                <w:w w:val="110"/>
-                <w:sz w:val="18"/>
-                <w:szCs w:val="18"/>
-              </w:rPr>
-              <w:t xml:space="preserve"> on the development of generative design and automation </w:t>
-            </w:r>
-            <w:r>
-              <w:rPr>
-                <w:rFonts w:ascii="PT Sans" w:hAnsi="PT Sans"/>
-                <w:w w:val="110"/>
-                <w:sz w:val="18"/>
-                <w:szCs w:val="18"/>
-              </w:rPr>
-              <w:t>product</w:t>
-            </w:r>
-            <w:r>
-              <w:rPr>
-                <w:rFonts w:ascii="PT Sans" w:hAnsi="PT Sans"/>
-                <w:w w:val="110"/>
-                <w:sz w:val="18"/>
-                <w:szCs w:val="18"/>
-              </w:rPr>
-              <w:t xml:space="preserve"> for architectural planning and feasibility analysis based on German building regulations and planning codes</w:t>
-            </w:r>
-            <w:r>
-              <w:rPr>
-                <w:rFonts w:ascii="PT Sans" w:hAnsi="PT Sans" w:hint="eastAsia"/>
-                <w:w w:val="110"/>
-                <w:sz w:val="18"/>
-                <w:szCs w:val="18"/>
-              </w:rPr>
-              <w:t xml:space="preserve">. </w:t>
-            </w:r>
-          </w:p>
-        </w:tc>
-      </w:tr>
-      <w:tr>
-        <w:trPr>
-          <w:trHeight w:val="20"/>
-        </w:trPr>
-        <w:tc>
-          <w:tcPr>
-            <w:tcW w:w="7326" w:type="dxa"/>
-            <w:gridSpan w:val="2"/>
-            <w:tcBorders>
-              <w:top w:val="nil"/>
-              <w:bottom w:val="nil"/>
-              <w:right w:val="nil"/>
-            </w:tcBorders>
-            <w:tcMar>
-              <w:bottom w:w="0" w:type="dxa"/>
-            </w:tcMar>
-          </w:tcPr>
-          <w:p>
-            <w:pPr>
-              <w:spacing w:line="360" w:lineRule="auto"/>
-              <w:rPr>
-                <w:rFonts w:ascii="PT Sans" w:hAnsi="PT Sans"/>
-                <w:b/>
-                <w:bCs/>
-                <w:w w:val="110"/>
-              </w:rPr>
-            </w:pPr>
-            <w:r>
-              <w:rPr>
-                <w:rFonts w:ascii="PT Sans" w:hAnsi="PT Sans" w:hint="eastAsia"/>
-                <w:b/>
-                <w:bCs/>
-                <w:w w:val="110"/>
-                <w:sz w:val="18"/>
-                <w:szCs w:val="18"/>
-              </w:rPr>
-              <w:t>Research Intern</w:t>
-            </w:r>
-            <w:r>
-              <w:rPr>
-                <w:rFonts w:ascii="PT Sans" w:hAnsi="PT Sans"/>
-                <w:b/>
-                <w:bCs/>
-                <w:w w:val="110"/>
-                <w:sz w:val="18"/>
-                <w:szCs w:val="18"/>
-              </w:rPr>
-              <w:t xml:space="preserve"> </w:t>
-            </w:r>
-            <w:r>
-              <w:rPr>
-                <w:rFonts w:ascii="PT Sans" w:hAnsi="PT Sans"/>
-                <w:i/>
-                <w:iCs/>
-                <w:w w:val="110"/>
-                <w:sz w:val="18"/>
-                <w:szCs w:val="18"/>
-              </w:rPr>
-              <w:t xml:space="preserve">@ </w:t>
-            </w:r>
-            <w:r>
-              <w:rPr>
-                <w:rFonts w:ascii="PT Sans" w:hAnsi="PT Sans" w:hint="eastAsia"/>
-                <w:i/>
-                <w:iCs/>
-                <w:w w:val="110"/>
-                <w:sz w:val="18"/>
-                <w:szCs w:val="18"/>
-              </w:rPr>
-              <w:t>Visual Media Lab, KAIST</w:t>
-            </w:r>
-          </w:p>
-        </w:tc>
-        <w:tc>
-          <w:tcPr>
-            <w:tcW w:w="2295" w:type="dxa"/>
-            <w:gridSpan w:val="3"/>
-            <w:tcBorders>
-              <w:top w:val="nil"/>
-              <w:left w:val="nil"/>
-              <w:bottom w:val="nil"/>
-            </w:tcBorders>
-            <w:tcMar>
-              <w:bottom w:w="0" w:type="dxa"/>
-            </w:tcMar>
-          </w:tcPr>
-          <w:p>
-            <w:pPr>
-              <w:spacing w:line="360" w:lineRule="auto"/>
-              <w:jc w:val="right"/>
-              <w:rPr>
-                <w:rFonts w:ascii="PT Sans" w:hAnsi="PT Sans"/>
-                <w:b/>
-                <w:bCs/>
-                <w:w w:val="110"/>
-                <w:sz w:val="18"/>
-                <w:szCs w:val="18"/>
-              </w:rPr>
-            </w:pPr>
-            <w:r>
-              <w:rPr>
-                <w:rFonts w:ascii="PT Sans" w:hAnsi="PT Sans" w:hint="eastAsia"/>
-                <w:b/>
-                <w:bCs/>
-                <w:w w:val="110"/>
-                <w:sz w:val="18"/>
-                <w:szCs w:val="18"/>
-              </w:rPr>
-              <w:t>Dec</w:t>
-            </w:r>
-            <w:r>
-              <w:rPr>
-                <w:rFonts w:ascii="PT Sans" w:hAnsi="PT Sans"/>
-                <w:b/>
-                <w:bCs/>
-                <w:w w:val="110"/>
-                <w:sz w:val="18"/>
-                <w:szCs w:val="18"/>
-              </w:rPr>
-              <w:t xml:space="preserve"> 202</w:t>
-            </w:r>
-            <w:r>
-              <w:rPr>
-                <w:rFonts w:ascii="PT Sans" w:hAnsi="PT Sans" w:hint="eastAsia"/>
-                <w:b/>
-                <w:bCs/>
-                <w:w w:val="110"/>
-                <w:sz w:val="18"/>
-                <w:szCs w:val="18"/>
-              </w:rPr>
-              <w:t>5</w:t>
-            </w:r>
-            <w:r>
-              <w:rPr>
-                <w:rFonts w:ascii="PT Sans" w:hAnsi="PT Sans"/>
-                <w:b/>
-                <w:bCs/>
-                <w:w w:val="110"/>
-                <w:sz w:val="18"/>
-                <w:szCs w:val="18"/>
-              </w:rPr>
-              <w:t xml:space="preserve"> </w:t>
-            </w:r>
-            <w:r>
-              <w:rPr>
-                <w:rFonts w:ascii="PT Sans" w:hAnsi="PT Sans"/>
-                <w:b/>
-                <w:bCs/>
-                <w:w w:val="110"/>
-                <w:sz w:val="18"/>
-                <w:szCs w:val="18"/>
-              </w:rPr>
-              <w:t>–</w:t>
-            </w:r>
-            <w:r>
-              <w:rPr>
-                <w:rFonts w:ascii="PT Sans" w:hAnsi="PT Sans"/>
-                <w:b/>
-                <w:bCs/>
-                <w:w w:val="110"/>
-                <w:sz w:val="18"/>
-                <w:szCs w:val="18"/>
-              </w:rPr>
-              <w:t xml:space="preserve"> </w:t>
-            </w:r>
-            <w:r>
-              <w:rPr>
-                <w:rFonts w:ascii="PT Sans" w:hAnsi="PT Sans" w:hint="eastAsia"/>
-                <w:b/>
-                <w:bCs/>
-                <w:w w:val="110"/>
-                <w:sz w:val="18"/>
-                <w:szCs w:val="18"/>
-              </w:rPr>
-              <w:t>Feb 2026</w:t>
-            </w:r>
-          </w:p>
-        </w:tc>
-      </w:tr>
-      <w:tr>
-        <w:trPr>
-          <w:trHeight w:val="57"/>
-        </w:trPr>
-        <w:tc>
-          <w:tcPr>
-            <w:tcW w:w="9621" w:type="dxa"/>
-            <w:gridSpan w:val="5"/>
-            <w:tcBorders>
-              <w:top w:val="nil"/>
-              <w:bottom w:val="nil"/>
-            </w:tcBorders>
-            <w:tcMar>
-              <w:top w:w="0" w:type="dxa"/>
-            </w:tcMar>
-          </w:tcPr>
-          <w:p>
-            <w:pPr>
-              <w:pStyle w:val="ListParagraph"/>
-              <w:spacing w:line="276" w:lineRule="auto"/>
-              <w:ind w:leftChars="-1" w:left="-2"/>
-              <w:jc w:val="both"/>
-              <w:rPr>
-                <w:rFonts w:ascii="PT Sans" w:hAnsi="PT Sans"/>
-                <w:w w:val="110"/>
-                <w:sz w:val="18"/>
-                <w:szCs w:val="18"/>
-              </w:rPr>
-            </w:pPr>
-            <w:r>
-              <w:rPr>
-                <w:rFonts w:ascii="PT Sans" w:hAnsi="PT Sans"/>
-                <w:w w:val="110"/>
-                <w:sz w:val="18"/>
-                <w:szCs w:val="18"/>
-              </w:rPr>
-              <w:t>Contributed to the development of a multimodal virtual space automation system funded by KOCCA, focusing on converting interior image inputs into coherent 3D scenes using models for image-to-3D reconstruction, object detection, and semantic segmentation.</w:t>
-            </w:r>
-          </w:p>
-        </w:tc>
-      </w:tr>
-      <w:tr>
-        <w:trPr>
-          <w:trHeight w:val="18"/>
-        </w:trPr>
-        <w:tc>
-          <w:tcPr>
-            <w:tcW w:w="6804" w:type="dxa"/>
-            <w:tcBorders>
-              <w:top w:val="nil"/>
-              <w:bottom w:val="nil"/>
-              <w:right w:val="nil"/>
-            </w:tcBorders>
-            <w:tcMar>
-              <w:bottom w:w="0" w:type="dxa"/>
-            </w:tcMar>
-          </w:tcPr>
-          <w:p>
-            <w:pPr>
-              <w:spacing w:line="276" w:lineRule="auto"/>
-              <w:jc w:val="both"/>
-              <w:rPr>
-                <w:rFonts w:ascii="PT Sans" w:hAnsi="PT Sans"/>
-                <w:b/>
-                <w:bCs/>
-                <w:w w:val="110"/>
-                <w:sz w:val="18"/>
-                <w:szCs w:val="18"/>
-              </w:rPr>
-            </w:pPr>
-            <w:r>
-              <w:rPr>
-                <w:rFonts w:ascii="PT Sans" w:hAnsi="PT Sans" w:hint="eastAsia"/>
-                <w:b/>
-                <w:bCs/>
-                <w:w w:val="110"/>
-                <w:sz w:val="18"/>
-                <w:szCs w:val="18"/>
-              </w:rPr>
-              <w:t>Software Engineer</w:t>
-            </w:r>
-            <w:r>
-              <w:rPr>
-                <w:rFonts w:ascii="PT Sans" w:hAnsi="PT Sans"/>
-                <w:b/>
-                <w:bCs/>
-                <w:w w:val="110"/>
-                <w:sz w:val="18"/>
-                <w:szCs w:val="18"/>
-              </w:rPr>
-              <w:t xml:space="preserve"> </w:t>
-            </w:r>
-            <w:r>
-              <w:rPr>
-                <w:rFonts w:ascii="PT Sans" w:hAnsi="PT Sans"/>
-                <w:i/>
-                <w:iCs/>
-                <w:w w:val="110"/>
-                <w:sz w:val="18"/>
-                <w:szCs w:val="18"/>
-              </w:rPr>
-              <w:t xml:space="preserve">@ </w:t>
-            </w:r>
-            <w:r>
-              <w:rPr>
-                <w:rFonts w:ascii="PT Sans" w:hAnsi="PT Sans"/>
-                <w:i/>
-                <w:iCs/>
-                <w:w w:val="110"/>
-                <w:sz w:val="18"/>
-                <w:szCs w:val="18"/>
-              </w:rPr>
-              <w:t>Spacewalk</w:t>
-            </w:r>
-          </w:p>
-        </w:tc>
-        <w:tc>
-          <w:tcPr>
-            <w:tcW w:w="2817" w:type="dxa"/>
-            <w:gridSpan w:val="4"/>
-            <w:tcBorders>
-              <w:top w:val="nil"/>
-              <w:left w:val="nil"/>
-              <w:bottom w:val="nil"/>
-            </w:tcBorders>
-            <w:tcMar>
-              <w:bottom w:w="0" w:type="dxa"/>
-            </w:tcMar>
-          </w:tcPr>
-          <w:p>
-            <w:pPr>
-              <w:spacing w:line="360" w:lineRule="auto"/>
-              <w:jc w:val="right"/>
-              <w:rPr>
-                <w:rFonts w:ascii="PT Sans" w:hAnsi="PT Sans"/>
-                <w:b/>
-                <w:bCs/>
-                <w:w w:val="110"/>
-                <w:sz w:val="18"/>
-                <w:szCs w:val="18"/>
-              </w:rPr>
-            </w:pPr>
-            <w:r>
-              <w:rPr>
-                <w:rFonts w:ascii="PT Sans" w:hAnsi="PT Sans"/>
-                <w:b/>
-                <w:bCs/>
-                <w:w w:val="110"/>
-                <w:sz w:val="18"/>
-                <w:szCs w:val="18"/>
-              </w:rPr>
-              <w:t xml:space="preserve">Jan 2022 </w:t>
-            </w:r>
-            <w:r>
-              <w:rPr>
-                <w:rFonts w:ascii="PT Sans" w:hAnsi="PT Sans"/>
-                <w:b/>
-                <w:bCs/>
-                <w:w w:val="110"/>
-                <w:sz w:val="18"/>
-                <w:szCs w:val="18"/>
-              </w:rPr>
-              <w:t>–</w:t>
-            </w:r>
-            <w:r>
-              <w:rPr>
-                <w:rFonts w:ascii="PT Sans" w:hAnsi="PT Sans"/>
-                <w:b/>
-                <w:bCs/>
-                <w:w w:val="110"/>
-                <w:sz w:val="18"/>
-                <w:szCs w:val="18"/>
-              </w:rPr>
-              <w:t xml:space="preserve"> </w:t>
-            </w:r>
-            <w:r>
-              <w:rPr>
-                <w:rFonts w:ascii="PT Sans" w:hAnsi="PT Sans" w:hint="eastAsia"/>
-                <w:b/>
-                <w:bCs/>
-                <w:w w:val="110"/>
-                <w:sz w:val="18"/>
-                <w:szCs w:val="18"/>
-              </w:rPr>
-              <w:t>Nov 2025</w:t>
-            </w:r>
-          </w:p>
-        </w:tc>
-      </w:tr>
-      <w:tr>
-        <w:trPr>
-          <w:trHeight w:val="181"/>
-        </w:trPr>
-        <w:tc>
-          <w:tcPr>
-            <w:tcW w:w="9621" w:type="dxa"/>
-            <w:gridSpan w:val="5"/>
-            <w:tcBorders>
-              <w:top w:val="nil"/>
-              <w:bottom w:val="nil"/>
-            </w:tcBorders>
-            <w:tcMar>
-              <w:top w:w="0" w:type="dxa"/>
-              <w:bottom w:w="142" w:type="dxa"/>
-            </w:tcMar>
-          </w:tcPr>
-          <w:p>
-            <w:pPr>
-              <w:spacing w:line="276" w:lineRule="auto"/>
-              <w:jc w:val="both"/>
-              <w:rPr>
-                <w:rFonts w:ascii="PT Sans" w:hAnsi="PT Sans"/>
-                <w:w w:val="110"/>
-                <w:sz w:val="18"/>
-                <w:szCs w:val="18"/>
-              </w:rPr>
-            </w:pPr>
-            <w:r>
-              <w:rPr>
-                <w:rFonts w:ascii="PT Sans" w:hAnsi="PT Sans"/>
-                <w:w w:val="110"/>
-                <w:sz w:val="18"/>
-                <w:szCs w:val="18"/>
-              </w:rPr>
-              <w:t>Conducted research and development to productionize geometric algorithms for architectural planning and feasibility analysis. Developed computational design systems that translate spatial constraints, planning requirements, and geometric conditions into workflows for office layout automation, apartment placement, housing feasibility studies, and mass-planning.</w:t>
-            </w:r>
-          </w:p>
-        </w:tc>
-      </w:tr>
-      <w:tr>
-        <w:trPr>
-          <w:trHeight w:val="181"/>
-        </w:trPr>
-        <w:tc>
-          <w:tcPr>
-            <w:tcW w:w="6804" w:type="dxa"/>
-            <w:tcBorders>
-              <w:top w:val="nil"/>
-              <w:bottom w:val="nil"/>
-              <w:right w:val="nil"/>
-            </w:tcBorders>
-            <w:tcMar>
-              <w:bottom w:w="57" w:type="dxa"/>
-            </w:tcMar>
-          </w:tcPr>
-          <w:p>
-            <w:pPr>
-              <w:spacing w:line="276" w:lineRule="auto"/>
-              <w:jc w:val="both"/>
-              <w:rPr>
-                <w:rFonts w:ascii="PT Sans" w:hAnsi="PT Sans"/>
-                <w:w w:val="110"/>
-                <w:sz w:val="18"/>
-                <w:szCs w:val="18"/>
-              </w:rPr>
-            </w:pPr>
-            <w:r>
-              <w:rPr>
-                <w:rFonts w:ascii="PT Sans" w:hAnsi="PT Sans"/>
-                <w:b/>
-                <w:bCs/>
-                <w:w w:val="110"/>
-                <w:sz w:val="18"/>
-                <w:szCs w:val="18"/>
-              </w:rPr>
-              <w:t>Design</w:t>
-            </w:r>
-            <w:r>
-              <w:rPr>
-                <w:rFonts w:ascii="PT Sans" w:hAnsi="PT Sans" w:hint="eastAsia"/>
-                <w:b/>
-                <w:bCs/>
-                <w:w w:val="110"/>
-                <w:sz w:val="18"/>
-                <w:szCs w:val="18"/>
-              </w:rPr>
-              <w:t xml:space="preserve"> Intern</w:t>
-            </w:r>
-            <w:r>
-              <w:rPr>
-                <w:rFonts w:ascii="PT Sans" w:hAnsi="PT Sans"/>
-                <w:b/>
-                <w:bCs/>
-                <w:w w:val="110"/>
-                <w:sz w:val="18"/>
-                <w:szCs w:val="18"/>
-              </w:rPr>
-              <w:t xml:space="preserve"> </w:t>
-            </w:r>
-            <w:r>
-              <w:rPr>
-                <w:rFonts w:ascii="PT Sans" w:hAnsi="PT Sans"/>
-                <w:i/>
-                <w:iCs/>
-                <w:w w:val="110"/>
-                <w:sz w:val="18"/>
-                <w:szCs w:val="18"/>
-              </w:rPr>
-              <w:t xml:space="preserve">@ </w:t>
-            </w:r>
-            <w:r>
-              <w:rPr>
-                <w:rFonts w:ascii="PT Sans" w:hAnsi="PT Sans" w:hint="eastAsia"/>
-                <w:i/>
-                <w:iCs/>
-                <w:w w:val="110"/>
-                <w:sz w:val="18"/>
-                <w:szCs w:val="18"/>
-              </w:rPr>
-              <w:t>SANGJI</w:t>
-            </w:r>
-            <w:r>
-              <w:rPr>
-                <w:rFonts w:ascii="PT Sans" w:hAnsi="PT Sans"/>
-                <w:i/>
-                <w:iCs/>
-                <w:w w:val="110"/>
-                <w:sz w:val="18"/>
-                <w:szCs w:val="18"/>
-              </w:rPr>
-              <w:t xml:space="preserve"> </w:t>
-            </w:r>
-            <w:r>
-              <w:rPr>
-                <w:rFonts w:ascii="PT Sans" w:hAnsi="PT Sans" w:hint="eastAsia"/>
-                <w:i/>
-                <w:iCs/>
-                <w:w w:val="110"/>
-                <w:sz w:val="18"/>
-                <w:szCs w:val="18"/>
-              </w:rPr>
-              <w:t>Architects</w:t>
-            </w:r>
-          </w:p>
-        </w:tc>
-        <w:tc>
-          <w:tcPr>
-            <w:tcW w:w="2817" w:type="dxa"/>
-            <w:gridSpan w:val="4"/>
-            <w:tcBorders>
-              <w:top w:val="nil"/>
-              <w:left w:val="nil"/>
-              <w:bottom w:val="nil"/>
-            </w:tcBorders>
-            <w:tcMar>
-              <w:bottom w:w="57" w:type="dxa"/>
-            </w:tcMar>
-            <w:vAlign w:val="bottom"/>
-          </w:tcPr>
-          <w:p>
-            <w:pPr>
-              <w:spacing w:line="276" w:lineRule="auto"/>
-              <w:jc w:val="right"/>
-              <w:rPr>
-                <w:rFonts w:ascii="PT Sans" w:hAnsi="PT Sans"/>
-                <w:w w:val="110"/>
-                <w:sz w:val="18"/>
-                <w:szCs w:val="18"/>
-              </w:rPr>
-            </w:pPr>
-            <w:r>
-              <w:rPr>
-                <w:rFonts w:ascii="PT Sans" w:hAnsi="PT Sans"/>
-                <w:b/>
-                <w:bCs/>
-                <w:w w:val="110"/>
-                <w:sz w:val="18"/>
-                <w:szCs w:val="18"/>
-              </w:rPr>
-              <w:t>Jun 2019 – Jul 2019</w:t>
-            </w:r>
-          </w:p>
-        </w:tc>
-      </w:tr>
-      <w:tr>
-        <w:trPr>
-          <w:trHeight w:val="402"/>
-        </w:trPr>
-        <w:tc>
-          <w:tcPr>
-            <w:tcW w:w="9621" w:type="dxa"/>
-            <w:gridSpan w:val="5"/>
-            <w:tcBorders>
-              <w:top w:val="nil"/>
-              <w:bottom w:val="nil"/>
-            </w:tcBorders>
-            <w:tcMar>
-              <w:top w:w="0" w:type="dxa"/>
-            </w:tcMar>
-          </w:tcPr>
-          <w:p>
-            <w:pPr>
-              <w:spacing w:line="276" w:lineRule="auto"/>
-              <w:jc w:val="both"/>
-              <w:rPr>
-                <w:rFonts w:ascii="PT Sans" w:hAnsi="PT Sans"/>
-                <w:w w:val="110"/>
-                <w:sz w:val="18"/>
-                <w:szCs w:val="18"/>
-              </w:rPr>
-            </w:pPr>
-            <w:r>
-              <w:rPr>
-                <w:rFonts w:ascii="PT Sans" w:hAnsi="PT Sans"/>
-                <w:w w:val="110"/>
-                <w:sz w:val="18"/>
-                <w:szCs w:val="18"/>
-              </w:rPr>
-              <w:t>Supported architectural design development through drawings, 3D visualizations, site analysis, and mass studies. Assisted with competition proposals from concept development to schematic design.</w:t>
-            </w:r>
-          </w:p>
-        </w:tc>
-      </w:tr>
-      <w:tr>
-        <w:trPr>
-          <w:trHeight w:val="16"/>
-        </w:trPr>
-        <w:tc>
-          <w:tcPr>
-            <w:tcW w:w="7513" w:type="dxa"/>
-            <w:gridSpan w:val="4"/>
-            <w:tcBorders>
-              <w:top w:val="nil"/>
-              <w:bottom w:val="nil"/>
-              <w:right w:val="nil"/>
-            </w:tcBorders>
-            <w:tcMar>
-              <w:top w:w="142" w:type="dxa"/>
-              <w:bottom w:w="57" w:type="dxa"/>
-            </w:tcMar>
-          </w:tcPr>
-          <w:p>
-            <w:pPr>
-              <w:spacing w:line="276" w:lineRule="auto"/>
-              <w:jc w:val="both"/>
-              <w:rPr>
-                <w:rFonts w:ascii="PT Sans" w:hAnsi="PT Sans"/>
-                <w:w w:val="110"/>
-                <w:sz w:val="18"/>
-                <w:szCs w:val="18"/>
-              </w:rPr>
-            </w:pPr>
-            <w:r>
-              <w:rPr>
-                <w:rFonts w:ascii="PT Sans" w:hAnsi="PT Sans" w:hint="eastAsia"/>
-                <w:b/>
-                <w:bCs/>
-                <w:w w:val="110"/>
-                <w:sz w:val="18"/>
-                <w:szCs w:val="18"/>
-              </w:rPr>
-              <w:t>Research Intern</w:t>
-            </w:r>
-            <w:r>
-              <w:rPr>
-                <w:rFonts w:ascii="PT Sans" w:hAnsi="PT Sans"/>
-                <w:b/>
-                <w:bCs/>
-                <w:w w:val="110"/>
-                <w:sz w:val="18"/>
-                <w:szCs w:val="18"/>
-              </w:rPr>
-              <w:t xml:space="preserve"> </w:t>
-            </w:r>
-            <w:r>
-              <w:rPr>
-                <w:rFonts w:ascii="PT Sans" w:hAnsi="PT Sans"/>
-                <w:i/>
-                <w:iCs/>
-                <w:w w:val="110"/>
-                <w:sz w:val="18"/>
-                <w:szCs w:val="18"/>
-              </w:rPr>
-              <w:t xml:space="preserve">@ </w:t>
-            </w:r>
-            <w:r>
-              <w:rPr>
-                <w:rFonts w:ascii="PT Sans" w:hAnsi="PT Sans" w:hint="eastAsia"/>
-                <w:i/>
-                <w:iCs/>
-                <w:w w:val="110"/>
-                <w:sz w:val="18"/>
-                <w:szCs w:val="18"/>
-              </w:rPr>
-              <w:t>DART lab, KNUT</w:t>
-            </w:r>
-          </w:p>
-        </w:tc>
-        <w:tc>
-          <w:tcPr>
-            <w:tcW w:w="2108" w:type="dxa"/>
-            <w:tcBorders>
-              <w:top w:val="nil"/>
-              <w:left w:val="nil"/>
-              <w:bottom w:val="nil"/>
-            </w:tcBorders>
-            <w:tcMar>
-              <w:top w:w="142" w:type="dxa"/>
-              <w:bottom w:w="57" w:type="dxa"/>
-            </w:tcMar>
-            <w:vAlign w:val="bottom"/>
-          </w:tcPr>
-          <w:p>
-            <w:pPr>
-              <w:spacing w:line="276" w:lineRule="auto"/>
-              <w:jc w:val="right"/>
-              <w:rPr>
-                <w:rFonts w:ascii="PT Sans" w:hAnsi="PT Sans"/>
-                <w:w w:val="110"/>
-                <w:sz w:val="18"/>
-                <w:szCs w:val="18"/>
-              </w:rPr>
-            </w:pPr>
-            <w:r>
-              <w:rPr>
-                <w:rFonts w:ascii="PT Sans" w:hAnsi="PT Sans" w:hint="eastAsia"/>
-                <w:b/>
-                <w:bCs/>
-                <w:w w:val="110"/>
-                <w:sz w:val="18"/>
-                <w:szCs w:val="18"/>
-              </w:rPr>
-              <w:t>Mar</w:t>
-            </w:r>
-            <w:r>
-              <w:rPr>
-                <w:rFonts w:ascii="PT Sans" w:hAnsi="PT Sans"/>
-                <w:b/>
-                <w:bCs/>
-                <w:w w:val="110"/>
-                <w:sz w:val="18"/>
-                <w:szCs w:val="18"/>
-              </w:rPr>
-              <w:t xml:space="preserve"> 201</w:t>
-            </w:r>
-            <w:r>
-              <w:rPr>
-                <w:rFonts w:ascii="PT Sans" w:hAnsi="PT Sans" w:hint="eastAsia"/>
-                <w:b/>
-                <w:bCs/>
-                <w:w w:val="110"/>
-                <w:sz w:val="18"/>
-                <w:szCs w:val="18"/>
-              </w:rPr>
-              <w:t>8</w:t>
-            </w:r>
-            <w:r>
-              <w:rPr>
-                <w:rFonts w:ascii="PT Sans" w:hAnsi="PT Sans"/>
-                <w:b/>
-                <w:bCs/>
-                <w:w w:val="110"/>
-                <w:sz w:val="18"/>
-                <w:szCs w:val="18"/>
-              </w:rPr>
-              <w:t xml:space="preserve"> – </w:t>
-            </w:r>
-            <w:r>
-              <w:rPr>
-                <w:rFonts w:ascii="PT Sans" w:hAnsi="PT Sans" w:hint="eastAsia"/>
-                <w:b/>
-                <w:bCs/>
-                <w:w w:val="110"/>
-                <w:sz w:val="18"/>
-                <w:szCs w:val="18"/>
-              </w:rPr>
-              <w:t>Apr</w:t>
-            </w:r>
-            <w:r>
-              <w:rPr>
-                <w:rFonts w:ascii="PT Sans" w:hAnsi="PT Sans"/>
-                <w:b/>
-                <w:bCs/>
-                <w:w w:val="110"/>
-                <w:sz w:val="18"/>
-                <w:szCs w:val="18"/>
-              </w:rPr>
-              <w:t xml:space="preserve"> 20</w:t>
-            </w:r>
-            <w:r>
-              <w:rPr>
-                <w:rFonts w:ascii="PT Sans" w:hAnsi="PT Sans" w:hint="eastAsia"/>
-                <w:b/>
-                <w:bCs/>
-                <w:w w:val="110"/>
-                <w:sz w:val="18"/>
-                <w:szCs w:val="18"/>
-              </w:rPr>
-              <w:t>19</w:t>
-            </w:r>
-          </w:p>
-        </w:tc>
-      </w:tr>
-      <w:tr>
-        <w:trPr>
-          <w:trHeight w:val="506"/>
-        </w:trPr>
-        <w:tc>
-          <w:tcPr>
-            <w:tcW w:w="9621" w:type="dxa"/>
-            <w:gridSpan w:val="5"/>
-            <w:tcBorders>
-              <w:top w:val="nil"/>
-              <w:bottom w:val="single" w:sz="4" w:space="0" w:color="auto"/>
-            </w:tcBorders>
-            <w:tcMar>
-              <w:top w:w="0" w:type="dxa"/>
-              <w:bottom w:w="142" w:type="dxa"/>
-            </w:tcMar>
-          </w:tcPr>
-          <w:p>
-            <w:pPr>
-              <w:spacing w:line="276" w:lineRule="auto"/>
-              <w:jc w:val="both"/>
-              <w:rPr>
-                <w:rFonts w:ascii="PT Sans" w:hAnsi="PT Sans"/>
-                <w:w w:val="110"/>
-                <w:sz w:val="18"/>
-                <w:szCs w:val="18"/>
-              </w:rPr>
-            </w:pPr>
-            <w:r>
-              <w:rPr>
-                <w:rFonts w:ascii="PT Sans" w:hAnsi="PT Sans"/>
-                <w:w w:val="110"/>
-                <w:sz w:val="18"/>
-                <w:szCs w:val="18"/>
-              </w:rPr>
-              <w:t>Assisted with architectural and urban design studies, developing parametric 3D models using Rhino and Grasshopper</w:t>
-            </w:r>
-            <w:r>
-              <w:rPr>
-                <w:rFonts w:ascii="PT Sans" w:hAnsi="PT Sans" w:hint="eastAsia"/>
-                <w:w w:val="110"/>
-                <w:sz w:val="18"/>
-                <w:szCs w:val="18"/>
-              </w:rPr>
-              <w:t xml:space="preserve">. </w:t>
-            </w:r>
-          </w:p>
-        </w:tc>
-      </w:tr>
-      <w:tr>
-        <w:trPr>
-          <w:trHeight w:val="186"/>
-        </w:trPr>
-        <w:tc>
-          <w:tcPr>
-            <w:tcW w:w="9621" w:type="dxa"/>
-            <w:gridSpan w:val="5"/>
-            <w:tcBorders>
-              <w:top w:val="single" w:sz="4" w:space="0" w:color="auto"/>
-              <w:bottom w:val="nil"/>
-            </w:tcBorders>
-            <w:tcMar>
-              <w:bottom w:w="0" w:type="dxa"/>
-            </w:tcMar>
-          </w:tcPr>
-          <w:p>
-            <w:pPr>
-              <w:spacing w:line="276" w:lineRule="auto"/>
-              <w:jc w:val="both"/>
-              <w:rPr>
-                <w:rFonts w:ascii="PT Sans" w:hAnsi="PT Sans"/>
-                <w:w w:val="110"/>
-                <w:szCs w:val="22"/>
-              </w:rPr>
-            </w:pPr>
-            <w:r>
-              <w:rPr>
-                <w:rFonts w:ascii="PT Sans" w:hAnsi="PT Sans"/>
-                <w:b/>
-                <w:bCs/>
-                <w:w w:val="110"/>
-                <w:szCs w:val="22"/>
-              </w:rPr>
-              <w:t>PUBLICATION</w:t>
-            </w:r>
-            <w:r>
-              <w:rPr>
-                <w:rFonts w:ascii="PT Sans" w:hAnsi="PT Sans"/>
-                <w:b/>
-                <w:bCs/>
-                <w:w w:val="110"/>
-                <w:szCs w:val="22"/>
-              </w:rPr>
-              <w:t>S</w:t>
-            </w:r>
-          </w:p>
-        </w:tc>
-      </w:tr>
-      <w:tr>
-        <w:trPr>
-          <w:trHeight w:val="18"/>
-        </w:trPr>
-        <w:tc>
-          <w:tcPr>
             <w:tcW w:w="7371" w:type="dxa"/>
             <w:gridSpan w:val="3"/>
             <w:tcBorders>
@@ -2084,7 +2034,7 @@
           <w:p>
             <w:pPr>
               <w:rPr>
-                <w:rFonts w:ascii="PT Sans" w:hAnsi="PT Sans"/>
+                <w:rFonts w:ascii="PT Sans" w:hAnsi="PT Sans" w:hint="eastAsia"/>
                 <w:i/>
                 <w:iCs/>
                 <w:w w:val="110"/>
@@ -2161,9 +2111,15 @@
     </w:tbl>
     <w:p>
       <w:pPr>
+        <w:spacing w:after="0"/>
         <w:rPr>
-          <w:sz w:val="2"/>
-          <w:szCs w:val="2"/>
+          <w:rStyle w:val="Hyperlink"/>
+          <w:rFonts w:ascii="PT Sans" w:hAnsi="PT Sans"/>
+          <w:color w:val="7F7F7F" w:themeColor="text1" w:themeTint="80"/>
+          <w:w w:val="110"/>
+          <w:sz w:val="18"/>
+          <w:szCs w:val="18"/>
+          <w:u w:val="dotted"/>
         </w:rPr>
       </w:pPr>
     </w:p>
@@ -2228,7 +2184,6 @@
                 <w:w w:val="110"/>
                 <w:szCs w:val="22"/>
               </w:rPr>
-              <w:lastRenderedPageBreak/>
               <w:t>CERTIFICATION</w:t>
             </w:r>
             <w:r>

</xml_diff>